<commit_message>
A7 Unit 3 test: the last question is cut at Croix's word (he sat the paper: 17:27, did not know it) — 40 points, 20 questions, one transfer item; kit ecff0e2e848e; Unit 3 rebuilt at 0
Co-Authored-By: Claude Opus 5.5 <noreply@anthropic.com>
Claude-Session: https://claude.ai/code/session_015xYWeLUsuszQH6z7ADE9tj
</commit_message>
<xml_diff>
--- a/a7/build/out/u3/A7 Unit 3 Exponents and Scientific Notation - Test - Key.docx
+++ b/a7/build/out/u3/A7 Unit 3 Exponents and Scientific Notation - Test - Key.docx
@@ -70,7 +70,7 @@
                 <w:color w:val="6B6B6B"/>
                 <w:sz w:val="19"/>
               </w:rPr>
-              <w:t>41 points  ·  two periods; students continue the same paper</w:t>
+              <w:t>40 points  ·  two periods; students continue the same paper</w:t>
             </w:r>
             <w:r>
               <w:rPr>
@@ -6477,7 +6477,7 @@
           <w:color w:val="6B6B6B"/>
           <w:sz w:val="19"/>
         </w:rPr>
-        <w:t>12 points</w:t>
+        <w:t>11 points</w:t>
       </w:r>
     </w:p>
     <w:tbl>
@@ -8463,309 +8463,6 @@
         </w:rPr>
       </w:r>
     </w:p>
-    <w:tbl>
-      <w:tblPr>
-        <w:tblLayout w:type="fixed"/>
-        <w:tblLook w:firstColumn="1" w:firstRow="1" w:lastColumn="0" w:lastRow="0" w:noHBand="0" w:noVBand="1" w:val="04A0"/>
-        <w:tblLayout w:type="fixed"/>
-        <w:tblW w:w="9360" w:type="dxa"/>
-      </w:tblPr>
-      <w:tblGrid>
-        <w:gridCol w:w="9360"/>
-      </w:tblGrid>
-      <w:tr>
-        <w:trPr>
-          <w:cantSplit/>
-        </w:trPr>
-        <w:tc>
-          <w:tcPr>
-            <w:tcW w:type="dxa" w:w="9360"/>
-            <w:tcBorders>
-              <w:top w:val="nil"/>
-              <w:left w:val="nil"/>
-              <w:bottom w:val="nil"/>
-              <w:right w:val="nil"/>
-            </w:tcBorders>
-            <w:tcMar>
-              <w:top w:w="0" w:type="dxa"/>
-              <w:left w:w="0" w:type="dxa"/>
-              <w:bottom w:w="0" w:type="dxa"/>
-              <w:right w:w="0" w:type="dxa"/>
-            </w:tcMar>
-          </w:tcPr>
-          <w:p>
-            <w:pPr>
-              <w:spacing w:before="200" w:after="120"/>
-              <w:ind w:left="420" w:hanging="420"/>
-              <w:tabs>
-                <w:tab w:val="right" w:pos="9360"/>
-              </w:tabs>
-            </w:pPr>
-            <w:r>
-              <w:rPr>
-                <w:b/>
-                <w:i w:val="0"/>
-                <w:color w:val="1A1A1A"/>
-                <w:sz w:val="22"/>
-              </w:rPr>
-              <w:t xml:space="preserve">21.   </w:t>
-            </w:r>
-            <w:r>
-              <w:rPr>
-                <w:b w:val="0"/>
-                <w:i w:val="0"/>
-                <w:color w:val="1A1A1A"/>
-                <w:sz w:val="22"/>
-              </w:rPr>
-              <w:t xml:space="preserve">Between which two consecutive powers of 10 does  </w:t>
-            </w:r>
-            <w:r>
-              <w:drawing>
-                <wp:inline xmlns:a="http://schemas.openxmlformats.org/drawingml/2006/main" xmlns:pic="http://schemas.openxmlformats.org/drawingml/2006/picture">
-                  <wp:extent cx="655320" cy="146304"/>
-                  <wp:docPr id="99" name="Picture 99"/>
-                  <wp:cNvGraphicFramePr>
-                    <a:graphicFrameLocks noChangeAspect="1"/>
-                  </wp:cNvGraphicFramePr>
-                  <a:graphic>
-                    <a:graphicData uri="http://schemas.openxmlformats.org/drawingml/2006/picture">
-                      <pic:pic>
-                        <pic:nvPicPr>
-                          <pic:cNvPr id="0" name="0f2de37ba51fb35e.png"/>
-                          <pic:cNvPicPr/>
-                        </pic:nvPicPr>
-                        <pic:blipFill>
-                          <a:blip r:embed="rId106"/>
-                          <a:stretch>
-                            <a:fillRect/>
-                          </a:stretch>
-                        </pic:blipFill>
-                        <pic:spPr>
-                          <a:xfrm>
-                            <a:off x="0" y="0"/>
-                            <a:ext cx="655320" cy="146304"/>
-                          </a:xfrm>
-                          <a:prstGeom prst="rect"/>
-                        </pic:spPr>
-                      </pic:pic>
-                    </a:graphicData>
-                  </a:graphic>
-                </wp:inline>
-              </w:drawing>
-            </w:r>
-            <w:r>
-              <w:rPr>
-                <w:b w:val="0"/>
-                <w:i w:val="0"/>
-                <w:color w:val="1A1A1A"/>
-                <w:sz w:val="22"/>
-              </w:rPr>
-              <w:t xml:space="preserve">  lie?</w:t>
-            </w:r>
-            <w:r>
-              <w:tab/>
-            </w:r>
-            <w:r>
-              <w:rPr>
-                <w:b w:val="0"/>
-                <w:i/>
-                <w:color w:val="6B6B6B"/>
-                <w:sz w:val="19"/>
-              </w:rPr>
-              <w:t>1 pt</w:t>
-            </w:r>
-          </w:p>
-          <w:p>
-            <w:pPr>
-              <w:spacing w:before="40" w:after="60"/>
-              <w:ind w:left="420"/>
-            </w:pPr>
-            <w:r>
-              <w:rPr>
-                <w:b/>
-                <w:i/>
-                <w:color w:val="9E1B32"/>
-                <w:sz w:val="22"/>
-              </w:rPr>
-              <w:t xml:space="preserve">Between </w:t>
-            </w:r>
-            <w:r>
-              <w:drawing>
-                <wp:inline xmlns:a="http://schemas.openxmlformats.org/drawingml/2006/main" xmlns:pic="http://schemas.openxmlformats.org/drawingml/2006/picture">
-                  <wp:extent cx="277368" cy="143256"/>
-                  <wp:docPr id="100" name="Picture 100"/>
-                  <wp:cNvGraphicFramePr>
-                    <a:graphicFrameLocks noChangeAspect="1"/>
-                  </wp:cNvGraphicFramePr>
-                  <a:graphic>
-                    <a:graphicData uri="http://schemas.openxmlformats.org/drawingml/2006/picture">
-                      <pic:pic>
-                        <pic:nvPicPr>
-                          <pic:cNvPr id="0" name="e1eb27eff9ab3c20.png"/>
-                          <pic:cNvPicPr/>
-                        </pic:nvPicPr>
-                        <pic:blipFill>
-                          <a:blip r:embed="rId107"/>
-                          <a:stretch>
-                            <a:fillRect/>
-                          </a:stretch>
-                        </pic:blipFill>
-                        <pic:spPr>
-                          <a:xfrm>
-                            <a:off x="0" y="0"/>
-                            <a:ext cx="277368" cy="143256"/>
-                          </a:xfrm>
-                          <a:prstGeom prst="rect"/>
-                        </pic:spPr>
-                      </pic:pic>
-                    </a:graphicData>
-                  </a:graphic>
-                </wp:inline>
-              </w:drawing>
-            </w:r>
-            <w:r>
-              <w:rPr>
-                <w:b/>
-                <w:i/>
-                <w:color w:val="9E1B32"/>
-                <w:sz w:val="22"/>
-              </w:rPr>
-              <w:t xml:space="preserve"> and </w:t>
-            </w:r>
-            <w:r>
-              <w:drawing>
-                <wp:inline xmlns:a="http://schemas.openxmlformats.org/drawingml/2006/main" xmlns:pic="http://schemas.openxmlformats.org/drawingml/2006/picture">
-                  <wp:extent cx="280416" cy="143256"/>
-                  <wp:docPr id="101" name="Picture 101"/>
-                  <wp:cNvGraphicFramePr>
-                    <a:graphicFrameLocks noChangeAspect="1"/>
-                  </wp:cNvGraphicFramePr>
-                  <a:graphic>
-                    <a:graphicData uri="http://schemas.openxmlformats.org/drawingml/2006/picture">
-                      <pic:pic>
-                        <pic:nvPicPr>
-                          <pic:cNvPr id="0" name="80122f8883244372.png"/>
-                          <pic:cNvPicPr/>
-                        </pic:nvPicPr>
-                        <pic:blipFill>
-                          <a:blip r:embed="rId108"/>
-                          <a:stretch>
-                            <a:fillRect/>
-                          </a:stretch>
-                        </pic:blipFill>
-                        <pic:spPr>
-                          <a:xfrm>
-                            <a:off x="0" y="0"/>
-                            <a:ext cx="280416" cy="143256"/>
-                          </a:xfrm>
-                          <a:prstGeom prst="rect"/>
-                        </pic:spPr>
-                      </pic:pic>
-                    </a:graphicData>
-                  </a:graphic>
-                </wp:inline>
-              </w:drawing>
-            </w:r>
-            <w:r>
-              <w:rPr>
-                <w:b/>
-                <w:i/>
-                <w:color w:val="9E1B32"/>
-                <w:sz w:val="22"/>
-              </w:rPr>
-              <w:t>.</w:t>
-            </w:r>
-          </w:p>
-          <w:p>
-            <w:pPr>
-              <w:spacing w:before="0" w:after="120"/>
-              <w:ind w:left="420"/>
-            </w:pPr>
-            <w:r>
-              <w:rPr>
-                <w:b w:val="0"/>
-                <w:i/>
-                <w:color w:val="6B6B6B"/>
-                <w:sz w:val="19"/>
-              </w:rPr>
-              <w:t>4.7 is between 1 and 10, so the number is between 1×10</w:t>
-            </w:r>
-            <w:r>
-              <w:rPr>
-                <w:b w:val="0"/>
-                <w:i/>
-                <w:color w:val="6B6B6B"/>
-                <w:sz w:val="19"/>
-                <w:vertAlign w:val="superscript"/>
-              </w:rPr>
-              <w:t>-5</w:t>
-            </w:r>
-            <w:r>
-              <w:rPr>
-                <w:b w:val="0"/>
-                <w:i/>
-                <w:color w:val="6B6B6B"/>
-                <w:sz w:val="19"/>
-              </w:rPr>
-              <w:t xml:space="preserve"> and 1×10</w:t>
-            </w:r>
-            <w:r>
-              <w:rPr>
-                <w:b w:val="0"/>
-                <w:i/>
-                <w:color w:val="6B6B6B"/>
-                <w:sz w:val="19"/>
-                <w:vertAlign w:val="superscript"/>
-              </w:rPr>
-              <w:t>-4</w:t>
-            </w:r>
-            <w:r>
-              <w:rPr>
-                <w:b w:val="0"/>
-                <w:i/>
-                <w:color w:val="6B6B6B"/>
-                <w:sz w:val="19"/>
-              </w:rPr>
-              <w:t xml:space="preserve">. Both powers are needed for the point.  </w:t>
-            </w:r>
-            <w:r>
-              <w:rPr>
-                <w:b/>
-                <w:i/>
-                <w:color w:val="6B6B6B"/>
-                <w:sz w:val="19"/>
-              </w:rPr>
-              <w:t>TRANSFER ITEM — not on the practice test. Same benchmark, a surface nobody rehearsed.</w:t>
-            </w:r>
-          </w:p>
-          <w:p>
-            <w:pPr>
-              <w:spacing w:before="40" w:after="120"/>
-              <w:ind w:left="420"/>
-            </w:pPr>
-            <w:r>
-              <w:rPr>
-                <w:b w:val="0"/>
-                <w:i/>
-                <w:color w:val="6B6B6B"/>
-                <w:sz w:val="19"/>
-              </w:rPr>
-              <w:t>Scoring: 1 point.</w:t>
-            </w:r>
-          </w:p>
-        </w:tc>
-      </w:tr>
-    </w:tbl>
-    <w:p>
-      <w:pPr>
-        <w:spacing w:after="0" w:before="0" w:line="20" w:lineRule="exact"/>
-      </w:pPr>
-      <w:r>
-        <w:rPr>
-          <w:sz w:val="2"/>
-        </w:rPr>
-      </w:r>
-    </w:p>
     <w:p>
       <w:pPr>
         <w:keepNext/>
@@ -8795,7 +8492,7 @@
           <w:color w:val="1A1A1A"/>
           <w:sz w:val="20"/>
         </w:rPr>
-        <w:t>41 points, one point per lettered part.  Section 1 — 9  ·  Section 2 — 11  ·  Section 3 — 9  ·  Section 4 — 12</w:t>
+        <w:t>40 points, one point per lettered part.  Section 1 — 9  ·  Section 2 — 11  ·  Section 3 — 9  ·  Section 4 — 11</w:t>
       </w:r>
     </w:p>
     <w:tbl>
@@ -9375,7 +9072,7 @@
                 <w:color w:val="1A1A1A"/>
                 <w:sz w:val="21"/>
               </w:rPr>
-              <w:t>15,  16,  17,  18,  19,  20,  21</w:t>
+              <w:t>15,  16,  17,  18,  19,  20</w:t>
             </w:r>
           </w:p>
         </w:tc>
@@ -9406,7 +9103,7 @@
                 <w:color w:val="1A1A1A"/>
                 <w:sz w:val="21"/>
               </w:rPr>
-              <w:t>12</w:t>
+              <w:t>11</w:t>
             </w:r>
           </w:p>
         </w:tc>
@@ -9517,7 +9214,7 @@
                 <w:color w:val="1A1A1A"/>
                 <w:sz w:val="21"/>
               </w:rPr>
-              <w:t>41</w:t>
+              <w:t>40</w:t>
             </w:r>
           </w:p>
         </w:tc>
@@ -9580,7 +9277,7 @@
           <w:color w:val="6B6B6B"/>
           <w:sz w:val="19"/>
         </w:rPr>
-        <w:t>Transfer items (ruling 18): questions 10 and 21. Neither surface appears on the review or in any question bank.</w:t>
+        <w:t>Transfer item (ruling 18): question 10. Its surface appears on neither the review nor any question bank. A second transfer item was cut from this paper: Croix, 7 October 2026 — the old question 21 (between which two consecutive powers of 10 a number lies) needed a step the unit does not teach.</w:t>
       </w:r>
     </w:p>
     <w:sectPr>

</xml_diff>